<commit_message>
Reformat Prufy request file per plain text rules, regenerate docx
Co-Authored-By: Claude Fable 5 <noreply@anthropic.com>
</commit_message>
<xml_diff>
--- a/ответы/2026-07-08_пруфы-жизнь-в-деревне-2026.docx
+++ b/ответы/2026-07-08_пруфы-жизнь-в-деревне-2026.docx
@@ -556,7 +556,7 @@
     <w:link w:val="10"/>
     <w:uiPriority w:val="9"/>
     <w:qFormat/>
-    <w:rsid w:val="00962A6B"/>
+    <w:rsid w:val="009E5FE8"/>
     <w:pPr>
       <w:keepNext/>
       <w:keepLines/>
@@ -579,7 +579,7 @@
     <w:semiHidden/>
     <w:unhideWhenUsed/>
     <w:qFormat/>
-    <w:rsid w:val="00962A6B"/>
+    <w:rsid w:val="009E5FE8"/>
     <w:pPr>
       <w:keepNext/>
       <w:keepLines/>
@@ -602,7 +602,7 @@
     <w:semiHidden/>
     <w:unhideWhenUsed/>
     <w:qFormat/>
-    <w:rsid w:val="00962A6B"/>
+    <w:rsid w:val="009E5FE8"/>
     <w:pPr>
       <w:keepNext/>
       <w:keepLines/>
@@ -625,7 +625,7 @@
     <w:semiHidden/>
     <w:unhideWhenUsed/>
     <w:qFormat/>
-    <w:rsid w:val="00962A6B"/>
+    <w:rsid w:val="009E5FE8"/>
     <w:pPr>
       <w:keepNext/>
       <w:keepLines/>
@@ -648,7 +648,7 @@
     <w:semiHidden/>
     <w:unhideWhenUsed/>
     <w:qFormat/>
-    <w:rsid w:val="00962A6B"/>
+    <w:rsid w:val="009E5FE8"/>
     <w:pPr>
       <w:keepNext/>
       <w:keepLines/>
@@ -669,7 +669,7 @@
     <w:semiHidden/>
     <w:unhideWhenUsed/>
     <w:qFormat/>
-    <w:rsid w:val="00962A6B"/>
+    <w:rsid w:val="009E5FE8"/>
     <w:pPr>
       <w:keepNext/>
       <w:keepLines/>
@@ -692,7 +692,7 @@
     <w:semiHidden/>
     <w:unhideWhenUsed/>
     <w:qFormat/>
-    <w:rsid w:val="00962A6B"/>
+    <w:rsid w:val="009E5FE8"/>
     <w:pPr>
       <w:keepNext/>
       <w:keepLines/>
@@ -713,7 +713,7 @@
     <w:semiHidden/>
     <w:unhideWhenUsed/>
     <w:qFormat/>
-    <w:rsid w:val="00962A6B"/>
+    <w:rsid w:val="009E5FE8"/>
     <w:pPr>
       <w:keepNext/>
       <w:keepLines/>
@@ -736,7 +736,7 @@
     <w:semiHidden/>
     <w:unhideWhenUsed/>
     <w:qFormat/>
-    <w:rsid w:val="00962A6B"/>
+    <w:rsid w:val="009E5FE8"/>
     <w:pPr>
       <w:keepNext/>
       <w:keepLines/>
@@ -780,7 +780,7 @@
     <w:basedOn w:val="a0"/>
     <w:link w:val="1"/>
     <w:uiPriority w:val="9"/>
-    <w:rsid w:val="00962A6B"/>
+    <w:rsid w:val="009E5FE8"/>
     <w:rPr>
       <w:rFonts w:asciiTheme="majorHAnsi" w:eastAsiaTheme="majorEastAsia" w:hAnsiTheme="majorHAnsi" w:cstheme="majorBidi"/>
       <w:color w:val="0F4761" w:themeColor="accent1" w:themeShade="BF"/>
@@ -794,7 +794,7 @@
     <w:link w:val="2"/>
     <w:uiPriority w:val="9"/>
     <w:semiHidden/>
-    <w:rsid w:val="00962A6B"/>
+    <w:rsid w:val="009E5FE8"/>
     <w:rPr>
       <w:rFonts w:asciiTheme="majorHAnsi" w:eastAsiaTheme="majorEastAsia" w:hAnsiTheme="majorHAnsi" w:cstheme="majorBidi"/>
       <w:color w:val="0F4761" w:themeColor="accent1" w:themeShade="BF"/>
@@ -808,7 +808,7 @@
     <w:link w:val="3"/>
     <w:uiPriority w:val="9"/>
     <w:semiHidden/>
-    <w:rsid w:val="00962A6B"/>
+    <w:rsid w:val="009E5FE8"/>
     <w:rPr>
       <w:rFonts w:eastAsiaTheme="majorEastAsia" w:cstheme="majorBidi"/>
       <w:color w:val="0F4761" w:themeColor="accent1" w:themeShade="BF"/>
@@ -822,7 +822,7 @@
     <w:link w:val="4"/>
     <w:uiPriority w:val="9"/>
     <w:semiHidden/>
-    <w:rsid w:val="00962A6B"/>
+    <w:rsid w:val="009E5FE8"/>
     <w:rPr>
       <w:rFonts w:eastAsiaTheme="majorEastAsia" w:cstheme="majorBidi"/>
       <w:i/>
@@ -836,7 +836,7 @@
     <w:link w:val="5"/>
     <w:uiPriority w:val="9"/>
     <w:semiHidden/>
-    <w:rsid w:val="00962A6B"/>
+    <w:rsid w:val="009E5FE8"/>
     <w:rPr>
       <w:rFonts w:eastAsiaTheme="majorEastAsia" w:cstheme="majorBidi"/>
       <w:color w:val="0F4761" w:themeColor="accent1" w:themeShade="BF"/>
@@ -848,7 +848,7 @@
     <w:link w:val="6"/>
     <w:uiPriority w:val="9"/>
     <w:semiHidden/>
-    <w:rsid w:val="00962A6B"/>
+    <w:rsid w:val="009E5FE8"/>
     <w:rPr>
       <w:rFonts w:eastAsiaTheme="majorEastAsia" w:cstheme="majorBidi"/>
       <w:i/>
@@ -862,7 +862,7 @@
     <w:link w:val="7"/>
     <w:uiPriority w:val="9"/>
     <w:semiHidden/>
-    <w:rsid w:val="00962A6B"/>
+    <w:rsid w:val="009E5FE8"/>
     <w:rPr>
       <w:rFonts w:eastAsiaTheme="majorEastAsia" w:cstheme="majorBidi"/>
       <w:color w:val="595959" w:themeColor="text1" w:themeTint="A6"/>
@@ -874,7 +874,7 @@
     <w:link w:val="8"/>
     <w:uiPriority w:val="9"/>
     <w:semiHidden/>
-    <w:rsid w:val="00962A6B"/>
+    <w:rsid w:val="009E5FE8"/>
     <w:rPr>
       <w:rFonts w:eastAsiaTheme="majorEastAsia" w:cstheme="majorBidi"/>
       <w:i/>
@@ -888,7 +888,7 @@
     <w:link w:val="9"/>
     <w:uiPriority w:val="9"/>
     <w:semiHidden/>
-    <w:rsid w:val="00962A6B"/>
+    <w:rsid w:val="009E5FE8"/>
     <w:rPr>
       <w:rFonts w:eastAsiaTheme="majorEastAsia" w:cstheme="majorBidi"/>
       <w:color w:val="272727" w:themeColor="text1" w:themeTint="D8"/>
@@ -901,7 +901,7 @@
     <w:link w:val="a4"/>
     <w:uiPriority w:val="10"/>
     <w:qFormat/>
-    <w:rsid w:val="00962A6B"/>
+    <w:rsid w:val="009E5FE8"/>
     <w:pPr>
       <w:spacing w:after="80" w:line="240" w:lineRule="auto"/>
       <w:contextualSpacing/>
@@ -919,7 +919,7 @@
     <w:basedOn w:val="a0"/>
     <w:link w:val="a3"/>
     <w:uiPriority w:val="10"/>
-    <w:rsid w:val="00962A6B"/>
+    <w:rsid w:val="009E5FE8"/>
     <w:rPr>
       <w:rFonts w:asciiTheme="majorHAnsi" w:eastAsiaTheme="majorEastAsia" w:hAnsiTheme="majorHAnsi" w:cstheme="majorBidi"/>
       <w:spacing w:val="-10"/>
@@ -935,7 +935,7 @@
     <w:link w:val="a6"/>
     <w:uiPriority w:val="11"/>
     <w:qFormat/>
-    <w:rsid w:val="00962A6B"/>
+    <w:rsid w:val="009E5FE8"/>
     <w:pPr>
       <w:numPr>
         <w:ilvl w:val="1"/>
@@ -954,7 +954,7 @@
     <w:basedOn w:val="a0"/>
     <w:link w:val="a5"/>
     <w:uiPriority w:val="11"/>
-    <w:rsid w:val="00962A6B"/>
+    <w:rsid w:val="009E5FE8"/>
     <w:rPr>
       <w:rFonts w:eastAsiaTheme="majorEastAsia" w:cstheme="majorBidi"/>
       <w:color w:val="595959" w:themeColor="text1" w:themeTint="A6"/>
@@ -970,7 +970,7 @@
     <w:link w:val="22"/>
     <w:uiPriority w:val="29"/>
     <w:qFormat/>
-    <w:rsid w:val="00962A6B"/>
+    <w:rsid w:val="009E5FE8"/>
     <w:pPr>
       <w:spacing w:before="160"/>
       <w:jc w:val="center"/>
@@ -986,7 +986,7 @@
     <w:basedOn w:val="a0"/>
     <w:link w:val="21"/>
     <w:uiPriority w:val="29"/>
-    <w:rsid w:val="00962A6B"/>
+    <w:rsid w:val="009E5FE8"/>
     <w:rPr>
       <w:i/>
       <w:iCs/>
@@ -998,7 +998,7 @@
     <w:basedOn w:val="a"/>
     <w:uiPriority w:val="34"/>
     <w:qFormat/>
-    <w:rsid w:val="00962A6B"/>
+    <w:rsid w:val="009E5FE8"/>
     <w:pPr>
       <w:ind w:left="720"/>
       <w:contextualSpacing/>
@@ -1009,7 +1009,7 @@
     <w:basedOn w:val="a0"/>
     <w:uiPriority w:val="21"/>
     <w:qFormat/>
-    <w:rsid w:val="00962A6B"/>
+    <w:rsid w:val="009E5FE8"/>
     <w:rPr>
       <w:i/>
       <w:iCs/>
@@ -1023,7 +1023,7 @@
     <w:link w:val="aa"/>
     <w:uiPriority w:val="30"/>
     <w:qFormat/>
-    <w:rsid w:val="00962A6B"/>
+    <w:rsid w:val="009E5FE8"/>
     <w:pPr>
       <w:pBdr>
         <w:top w:val="single" w:sz="4" w:space="10" w:color="0F4761" w:themeColor="accent1" w:themeShade="BF"/>
@@ -1044,7 +1044,7 @@
     <w:basedOn w:val="a0"/>
     <w:link w:val="a9"/>
     <w:uiPriority w:val="30"/>
-    <w:rsid w:val="00962A6B"/>
+    <w:rsid w:val="009E5FE8"/>
     <w:rPr>
       <w:i/>
       <w:iCs/>
@@ -1056,7 +1056,7 @@
     <w:basedOn w:val="a0"/>
     <w:uiPriority w:val="32"/>
     <w:qFormat/>
-    <w:rsid w:val="00962A6B"/>
+    <w:rsid w:val="009E5FE8"/>
     <w:rPr>
       <w:b/>
       <w:bCs/>

</xml_diff>